<commit_message>
Update ERS with Arena requirements and final design; add Product Book PDF
- ERS: 27 RFs, 15 RNFs, 19 RNs (Arena, Neblina, Caça, Fuga, Raid, Liga, Corrida Segura, Guia por voz;
  relative effort scoring and 30 RP neutral capture), street-map prototypes in the final design and
  real prototype screens
- Product Book: prototype section with screenshots, QA results and build decisions; PDF build
- App: streak multiplier uses weekly streak; app.json name, permissions and splash; README

Co-Authored-By: Claude Opus 5.5 <noreply@anthropic.com>
Claude-Session: https://claude.ai/code/session_011HHWimTd3v1XUrBB78FqyY
</commit_message>
<xml_diff>
--- a/docs/ERS/NOMADE RUN - ERS (editável).docx
+++ b/docs/ERS/NOMADE RUN - ERS (editável).docx
@@ -383,6 +383,58 @@
         <w:pStyle w:val="Compact"/>
       </w:pPr>
       <w:r>
+        <w:t xml:space="preserve">Uma</w:t>
+      </w:r>
+      <w:r>
+        <w:t xml:space="preserve"> </w:t>
+      </w:r>
+      <w:r>
+        <w:rPr>
+          <w:bCs/>
+          <w:b/>
+        </w:rPr>
+        <w:t xml:space="preserve">Arena de modos de jogo</w:t>
+      </w:r>
+      <w:r>
+        <w:t xml:space="preserve"> </w:t>
+      </w:r>
+      <w:r>
+        <w:t xml:space="preserve">sobre o mapa: Domínio (território), Neblina (exploração), Raid (desafio coletivo da cidade), Fuga (corrida contra um fantasma) e Caça (baús espalhados pela cidade), além de Liga do Bairro semanal.</w:t>
+      </w:r>
+    </w:p>
+    <w:p>
+      <w:pPr>
+        <w:numPr>
+          <w:ilvl w:val="0"/>
+          <w:numId w:val="1003"/>
+        </w:numPr>
+        <w:pStyle w:val="Compact"/>
+      </w:pPr>
+      <w:r>
+        <w:t xml:space="preserve">Corrida Segura: compartilhamento da localização ao vivo com contatos escolhidos, botão SOS e alerta de parada prolongada.</w:t>
+      </w:r>
+    </w:p>
+    <w:p>
+      <w:pPr>
+        <w:numPr>
+          <w:ilvl w:val="0"/>
+          <w:numId w:val="1003"/>
+        </w:numPr>
+        <w:pStyle w:val="Compact"/>
+      </w:pPr>
+      <w:r>
+        <w:t xml:space="preserve">Guia por voz, que anuncia cada quilômetro e os eventos de jogo durante a corrida.</w:t>
+      </w:r>
+    </w:p>
+    <w:p>
+      <w:pPr>
+        <w:numPr>
+          <w:ilvl w:val="0"/>
+          <w:numId w:val="1003"/>
+        </w:numPr>
+        <w:pStyle w:val="Compact"/>
+      </w:pPr>
+      <w:r>
         <w:t xml:space="preserve">Envio de notificações quando um território da facção do usuário estiver sendo conquistado por outra facção.</w:t>
       </w:r>
     </w:p>
@@ -1075,19 +1127,341 @@
                 <w:bCs/>
                 <w:b/>
               </w:rPr>
-              <w:t xml:space="preserve">Modo Fantasma</w:t>
-            </w:r>
-          </w:p>
-        </w:tc>
-        <w:tc>
-          <w:tcPr/>
-          <w:p>
-            <w:pPr>
-              <w:pStyle w:val="Compact"/>
-              <w:jc w:val="left"/>
-            </w:pPr>
-            <w:r>
-              <w:t xml:space="preserve">Desafio em que o usuário corre contra a gravação do melhor tempo do dono da zona naquele trecho.</w:t>
+              <w:t xml:space="preserve">Arena</w:t>
+            </w:r>
+          </w:p>
+        </w:tc>
+        <w:tc>
+          <w:tcPr/>
+          <w:p>
+            <w:pPr>
+              <w:pStyle w:val="Compact"/>
+              <w:jc w:val="left"/>
+            </w:pPr>
+            <w:r>
+              <w:t xml:space="preserve">Conjunto dos modos de jogo do NOMADE RUN. Alguns valem em toda corrida (Domínio, Neblina e Raid); outros são</w:t>
+            </w:r>
+            <w:r>
+              <w:t xml:space="preserve"> </w:t>
+            </w:r>
+            <w:r>
+              <w:rPr>
+                <w:bCs/>
+                <w:b/>
+              </w:rPr>
+              <w:t xml:space="preserve">missões</w:t>
+            </w:r>
+            <w:r>
+              <w:t xml:space="preserve"> </w:t>
+            </w:r>
+            <w:r>
+              <w:t xml:space="preserve">escolhidas antes de sair (Fuga e Caça).</w:t>
+            </w:r>
+          </w:p>
+        </w:tc>
+      </w:tr>
+      <w:tr>
+        <w:tc>
+          <w:tcPr/>
+          <w:p>
+            <w:pPr>
+              <w:pStyle w:val="Compact"/>
+              <w:jc w:val="left"/>
+            </w:pPr>
+            <w:r>
+              <w:rPr>
+                <w:bCs/>
+                <w:b/>
+              </w:rPr>
+              <w:t xml:space="preserve">Missão</w:t>
+            </w:r>
+          </w:p>
+        </w:tc>
+        <w:tc>
+          <w:tcPr/>
+          <w:p>
+            <w:pPr>
+              <w:pStyle w:val="Compact"/>
+              <w:jc w:val="left"/>
+            </w:pPr>
+            <w:r>
+              <w:t xml:space="preserve">Modo de jogo opcional escolhido antes de iniciar uma corrida.</w:t>
+            </w:r>
+          </w:p>
+        </w:tc>
+      </w:tr>
+      <w:tr>
+        <w:tc>
+          <w:tcPr/>
+          <w:p>
+            <w:pPr>
+              <w:pStyle w:val="Compact"/>
+              <w:jc w:val="left"/>
+            </w:pPr>
+            <w:r>
+              <w:rPr>
+                <w:bCs/>
+                <w:b/>
+              </w:rPr>
+              <w:t xml:space="preserve">Neblina</w:t>
+            </w:r>
+          </w:p>
+        </w:tc>
+        <w:tc>
+          <w:tcPr/>
+          <w:p>
+            <w:pPr>
+              <w:pStyle w:val="Compact"/>
+              <w:jc w:val="left"/>
+            </w:pPr>
+            <w:r>
+              <w:t xml:space="preserve">Camada pessoal do mapa que começa</w:t>
+            </w:r>
+            <w:r>
+              <w:t xml:space="preserve"> </w:t>
+            </w:r>
+            <w:r>
+              <w:t xml:space="preserve">“</w:t>
+            </w:r>
+            <w:r>
+              <w:t xml:space="preserve">coberta</w:t>
+            </w:r>
+            <w:r>
+              <w:t xml:space="preserve">”</w:t>
+            </w:r>
+            <w:r>
+              <w:t xml:space="preserve"> </w:t>
+            </w:r>
+            <w:r>
+              <w:t xml:space="preserve">e é revelada nas células por onde o usuário corre (RN-016).</w:t>
+            </w:r>
+          </w:p>
+        </w:tc>
+      </w:tr>
+      <w:tr>
+        <w:tc>
+          <w:tcPr/>
+          <w:p>
+            <w:pPr>
+              <w:pStyle w:val="Compact"/>
+              <w:jc w:val="left"/>
+            </w:pPr>
+            <w:r>
+              <w:rPr>
+                <w:bCs/>
+                <w:b/>
+              </w:rPr>
+              <w:t xml:space="preserve">Fuga (Modo Fantasma)</w:t>
+            </w:r>
+          </w:p>
+        </w:tc>
+        <w:tc>
+          <w:tcPr/>
+          <w:p>
+            <w:pPr>
+              <w:pStyle w:val="Compact"/>
+              <w:jc w:val="left"/>
+            </w:pPr>
+            <w:r>
+              <w:t xml:space="preserve">Missão em que o usuário corre contra um fantasma num ritmo escolhido ou no melhor tempo de alguém (RN-019).</w:t>
+            </w:r>
+          </w:p>
+        </w:tc>
+      </w:tr>
+      <w:tr>
+        <w:tc>
+          <w:tcPr/>
+          <w:p>
+            <w:pPr>
+              <w:pStyle w:val="Compact"/>
+              <w:jc w:val="left"/>
+            </w:pPr>
+            <w:r>
+              <w:rPr>
+                <w:bCs/>
+                <w:b/>
+              </w:rPr>
+              <w:t xml:space="preserve">Caça</w:t>
+            </w:r>
+          </w:p>
+        </w:tc>
+        <w:tc>
+          <w:tcPr/>
+          <w:p>
+            <w:pPr>
+              <w:pStyle w:val="Compact"/>
+              <w:jc w:val="left"/>
+            </w:pPr>
+            <w:r>
+              <w:t xml:space="preserve">Missão em que o usuário abre baús virtuais ao passar perto deles (RN-017).</w:t>
+            </w:r>
+          </w:p>
+        </w:tc>
+      </w:tr>
+      <w:tr>
+        <w:tc>
+          <w:tcPr/>
+          <w:p>
+            <w:pPr>
+              <w:pStyle w:val="Compact"/>
+              <w:jc w:val="left"/>
+            </w:pPr>
+            <w:r>
+              <w:rPr>
+                <w:bCs/>
+                <w:b/>
+              </w:rPr>
+              <w:t xml:space="preserve">Raid</w:t>
+            </w:r>
+          </w:p>
+        </w:tc>
+        <w:tc>
+          <w:tcPr/>
+          <w:p>
+            <w:pPr>
+              <w:pStyle w:val="Compact"/>
+              <w:jc w:val="left"/>
+            </w:pPr>
+            <w:r>
+              <w:t xml:space="preserve">Desafio coletivo de 48 horas em que todos os corredores de uma cidade somam quilômetros contra um</w:t>
+            </w:r>
+            <w:r>
+              <w:t xml:space="preserve"> </w:t>
+            </w:r>
+            <w:r>
+              <w:t xml:space="preserve">“</w:t>
+            </w:r>
+            <w:r>
+              <w:t xml:space="preserve">chefão</w:t>
+            </w:r>
+            <w:r>
+              <w:t xml:space="preserve">”</w:t>
+            </w:r>
+            <w:r>
+              <w:t xml:space="preserve"> </w:t>
+            </w:r>
+            <w:r>
+              <w:t xml:space="preserve">(RN-018).</w:t>
+            </w:r>
+          </w:p>
+        </w:tc>
+      </w:tr>
+      <w:tr>
+        <w:tc>
+          <w:tcPr/>
+          <w:p>
+            <w:pPr>
+              <w:pStyle w:val="Compact"/>
+              <w:jc w:val="left"/>
+            </w:pPr>
+            <w:r>
+              <w:rPr>
+                <w:bCs/>
+                <w:b/>
+              </w:rPr>
+              <w:t xml:space="preserve">Esforço relativo</w:t>
+            </w:r>
+          </w:p>
+        </w:tc>
+        <w:tc>
+          <w:tcPr/>
+          <w:p>
+            <w:pPr>
+              <w:pStyle w:val="Compact"/>
+              <w:jc w:val="left"/>
+            </w:pPr>
+            <w:r>
+              <w:t xml:space="preserve">Comparação entre o ritmo da corrida e o ritmo habitual do próprio usuário, usada na pontuação (RN-001).</w:t>
+            </w:r>
+          </w:p>
+        </w:tc>
+      </w:tr>
+      <w:tr>
+        <w:tc>
+          <w:tcPr/>
+          <w:p>
+            <w:pPr>
+              <w:pStyle w:val="Compact"/>
+              <w:jc w:val="left"/>
+            </w:pPr>
+            <w:r>
+              <w:rPr>
+                <w:bCs/>
+                <w:b/>
+              </w:rPr>
+              <w:t xml:space="preserve">Liga do Bairro</w:t>
+            </w:r>
+          </w:p>
+        </w:tc>
+        <w:tc>
+          <w:tcPr/>
+          <w:p>
+            <w:pPr>
+              <w:pStyle w:val="Compact"/>
+              <w:jc w:val="left"/>
+            </w:pPr>
+            <w:r>
+              <w:t xml:space="preserve">Ranking semanal em grupos de 30 corredores com volume parecido (RN-015).</w:t>
+            </w:r>
+          </w:p>
+        </w:tc>
+      </w:tr>
+      <w:tr>
+        <w:tc>
+          <w:tcPr/>
+          <w:p>
+            <w:pPr>
+              <w:pStyle w:val="Compact"/>
+              <w:jc w:val="left"/>
+            </w:pPr>
+            <w:r>
+              <w:rPr>
+                <w:bCs/>
+                <w:b/>
+              </w:rPr>
+              <w:t xml:space="preserve">Sequência semanal</w:t>
+            </w:r>
+          </w:p>
+        </w:tc>
+        <w:tc>
+          <w:tcPr/>
+          <w:p>
+            <w:pPr>
+              <w:pStyle w:val="Compact"/>
+              <w:jc w:val="left"/>
+            </w:pPr>
+            <w:r>
+              <w:t xml:space="preserve">Número de semanas seguidas com pelo menos duas corridas válidas (RN-014).</w:t>
+            </w:r>
+          </w:p>
+        </w:tc>
+      </w:tr>
+      <w:tr>
+        <w:tc>
+          <w:tcPr/>
+          <w:p>
+            <w:pPr>
+              <w:pStyle w:val="Compact"/>
+              <w:jc w:val="left"/>
+            </w:pPr>
+            <w:r>
+              <w:rPr>
+                <w:bCs/>
+                <w:b/>
+              </w:rPr>
+              <w:t xml:space="preserve">Escolta</w:t>
+            </w:r>
+          </w:p>
+        </w:tc>
+        <w:tc>
+          <w:tcPr/>
+          <w:p>
+            <w:pPr>
+              <w:pStyle w:val="Compact"/>
+              <w:jc w:val="left"/>
+            </w:pPr>
+            <w:r>
+              <w:t xml:space="preserve">Compartilhamento da localização ao vivo com contatos escolhidos durante a corrida (RF-024).</w:t>
             </w:r>
           </w:p>
         </w:tc>
@@ -2034,13 +2408,13 @@
           <w:bCs/>
           <w:b/>
         </w:rPr>
-        <w:t xml:space="preserve">Desafiar o Fantasma:</w:t>
+        <w:t xml:space="preserve">Jogar na Arena:</w:t>
       </w:r>
       <w:r>
         <w:t xml:space="preserve"> </w:t>
       </w:r>
       <w:r>
-        <w:t xml:space="preserve">correr contra o melhor tempo do dono da zona para ganhar pontos extras.</w:t>
+        <w:t xml:space="preserve">além do território, revelar a Neblina, enfrentar o Raid da cidade, fugir do fantasma (Fuga) e abrir baús (Caça).</w:t>
       </w:r>
     </w:p>
     <w:p>
@@ -3312,7 +3686,7 @@
               <w:jc w:val="left"/>
             </w:pPr>
             <w:r>
-              <w:t xml:space="preserve">O sistema deve exibir o mapa da cidade no padrão dos aplicativos de navegação (ruas, nomes, parques e pontos de referência), com as zonas sobrepostas como hexágonos semitransparentes na cor da facção dona, sem esconder as ruas. Zonas neutras não são preenchidas, zonas bloqueadas aparecem hachuradas e zonas sob ataque aparecem com borda vermelha piscante. Ao tocar em uma zona, o sistema deve exibir nome, facção dona, influência de cada facção, nível de escudo, os três maiores corredores e os últimos eventos.</w:t>
+              <w:t xml:space="preserve">O sistema deve exibir o mapa da cidade no padrão dos aplicativos de navegação (ruas, nomes, parques e pontos de referência), com as zonas sobrepostas como hexágonos semitransparentes na cor da facção dona, sem esconder as ruas. Zonas neutras não são preenchidas, zonas bloqueadas aparecem hachuradas e zonas sob ataque aparecem com contorno em faixa de sinalização (amarelo e asfalto alternados). Cada facção, além da cor, tem um padrão de hachura próprio, para que pessoas com daltonismo também diferenciem os territórios. Ao tocar em uma zona, o sistema deve exibir nome, facção dona, influência de cada facção, nível de escudo, os três maiores corredores e os últimos eventos.</w:t>
             </w:r>
           </w:p>
         </w:tc>
@@ -3586,19 +3960,19 @@
               <w:jc w:val="left"/>
             </w:pPr>
             <w:r>
-              <w:t xml:space="preserve">Modo Fantasma</w:t>
-            </w:r>
-          </w:p>
-        </w:tc>
-        <w:tc>
-          <w:tcPr/>
-          <w:p>
-            <w:pPr>
-              <w:pStyle w:val="Compact"/>
-              <w:jc w:val="left"/>
-            </w:pPr>
-            <w:r>
-              <w:t xml:space="preserve">Dentro de uma zona dominada por outra facção, o usuário deve poder iniciar um desafio contra o melhor tempo do dono naquele trecho. O fantasma deve aparecer no mapa em tempo real, e o resultado deve ser exibido quando o usuário sair da zona.</w:t>
+              <w:t xml:space="preserve">Fuga (Modo Fantasma)</w:t>
+            </w:r>
+          </w:p>
+        </w:tc>
+        <w:tc>
+          <w:tcPr/>
+          <w:p>
+            <w:pPr>
+              <w:pStyle w:val="Compact"/>
+              <w:jc w:val="left"/>
+            </w:pPr>
+            <w:r>
+              <w:t xml:space="preserve">Antes de iniciar a corrida, o usuário deve poder escolher a missão Fuga e o ritmo do fantasma (ou o melhor tempo de um amigo ou do dono da zona). Durante a corrida, o sistema deve mostrar a cada segundo a distância entre o usuário e o fantasma e avisar por voz a cada 100 m de diferença. Ao terminar à frente do fantasma, o usuário recebe o bônus de pontos da RN-001.</w:t>
             </w:r>
           </w:p>
         </w:tc>
@@ -4062,6 +4436,356 @@
             </w:r>
             <w:r>
               <w:t xml:space="preserve">(1, 5 e 10 cidades).</w:t>
+            </w:r>
+          </w:p>
+        </w:tc>
+        <w:tc>
+          <w:tcPr/>
+          <w:p>
+            <w:pPr>
+              <w:pStyle w:val="Compact"/>
+              <w:jc w:val="left"/>
+            </w:pPr>
+            <w:r>
+              <w:t xml:space="preserve">Média</w:t>
+            </w:r>
+          </w:p>
+        </w:tc>
+      </w:tr>
+      <w:tr>
+        <w:tc>
+          <w:tcPr/>
+          <w:p>
+            <w:pPr>
+              <w:pStyle w:val="Compact"/>
+              <w:jc w:val="left"/>
+            </w:pPr>
+            <w:r>
+              <w:t xml:space="preserve">RF-021</w:t>
+            </w:r>
+          </w:p>
+        </w:tc>
+        <w:tc>
+          <w:tcPr/>
+          <w:p>
+            <w:pPr>
+              <w:pStyle w:val="Compact"/>
+              <w:jc w:val="left"/>
+            </w:pPr>
+            <w:r>
+              <w:t xml:space="preserve">Arena de Modos de Jogo</w:t>
+            </w:r>
+          </w:p>
+        </w:tc>
+        <w:tc>
+          <w:tcPr/>
+          <w:p>
+            <w:pPr>
+              <w:pStyle w:val="Compact"/>
+              <w:jc w:val="left"/>
+            </w:pPr>
+            <w:r>
+              <w:t xml:space="preserve">O sistema deve ter uma tela Arena com todos os modos de jogo e suas regras resumidas. Domínio, Neblina e Raid valem em qualquer corrida, sem escolha prévia. Antes de iniciar uma corrida, o usuário deve poder escolher uma missão: Corrida livre, Fuga ou Caça.</w:t>
+            </w:r>
+          </w:p>
+        </w:tc>
+        <w:tc>
+          <w:tcPr/>
+          <w:p>
+            <w:pPr>
+              <w:pStyle w:val="Compact"/>
+              <w:jc w:val="left"/>
+            </w:pPr>
+            <w:r>
+              <w:t xml:space="preserve">Alta</w:t>
+            </w:r>
+          </w:p>
+        </w:tc>
+      </w:tr>
+      <w:tr>
+        <w:tc>
+          <w:tcPr/>
+          <w:p>
+            <w:pPr>
+              <w:pStyle w:val="Compact"/>
+              <w:jc w:val="left"/>
+            </w:pPr>
+            <w:r>
+              <w:t xml:space="preserve">RF-022</w:t>
+            </w:r>
+          </w:p>
+        </w:tc>
+        <w:tc>
+          <w:tcPr/>
+          <w:p>
+            <w:pPr>
+              <w:pStyle w:val="Compact"/>
+              <w:jc w:val="left"/>
+            </w:pPr>
+            <w:r>
+              <w:t xml:space="preserve">Neblina</w:t>
+            </w:r>
+          </w:p>
+        </w:tc>
+        <w:tc>
+          <w:tcPr/>
+          <w:p>
+            <w:pPr>
+              <w:pStyle w:val="Compact"/>
+              <w:jc w:val="left"/>
+            </w:pPr>
+            <w:r>
+              <w:t xml:space="preserve">O sistema deve manter, para cada usuário, o conjunto de células do mapa já reveladas (RN-016), exibir esse conjunto como camada opcional no mapa e mostrar no perfil o total de células reveladas.</w:t>
+            </w:r>
+          </w:p>
+        </w:tc>
+        <w:tc>
+          <w:tcPr/>
+          <w:p>
+            <w:pPr>
+              <w:pStyle w:val="Compact"/>
+              <w:jc w:val="left"/>
+            </w:pPr>
+            <w:r>
+              <w:t xml:space="preserve">Média</w:t>
+            </w:r>
+          </w:p>
+        </w:tc>
+      </w:tr>
+      <w:tr>
+        <w:tc>
+          <w:tcPr/>
+          <w:p>
+            <w:pPr>
+              <w:pStyle w:val="Compact"/>
+              <w:jc w:val="left"/>
+            </w:pPr>
+            <w:r>
+              <w:t xml:space="preserve">RF-023</w:t>
+            </w:r>
+          </w:p>
+        </w:tc>
+        <w:tc>
+          <w:tcPr/>
+          <w:p>
+            <w:pPr>
+              <w:pStyle w:val="Compact"/>
+              <w:jc w:val="left"/>
+            </w:pPr>
+            <w:r>
+              <w:t xml:space="preserve">Caça</w:t>
+            </w:r>
+          </w:p>
+        </w:tc>
+        <w:tc>
+          <w:tcPr/>
+          <w:p>
+            <w:pPr>
+              <w:pStyle w:val="Compact"/>
+              <w:jc w:val="left"/>
+            </w:pPr>
+            <w:r>
+              <w:t xml:space="preserve">Na missão Caça, o sistema deve exibir baús no mapa e no painel da corrida (distância até o mais próximo), abrir automaticamente o baú quando o usuário passar perto dele (RN-017) e mostrar a recompensa recebida.</w:t>
+            </w:r>
+          </w:p>
+        </w:tc>
+        <w:tc>
+          <w:tcPr/>
+          <w:p>
+            <w:pPr>
+              <w:pStyle w:val="Compact"/>
+              <w:jc w:val="left"/>
+            </w:pPr>
+            <w:r>
+              <w:t xml:space="preserve">Média</w:t>
+            </w:r>
+          </w:p>
+        </w:tc>
+      </w:tr>
+      <w:tr>
+        <w:tc>
+          <w:tcPr/>
+          <w:p>
+            <w:pPr>
+              <w:pStyle w:val="Compact"/>
+              <w:jc w:val="left"/>
+            </w:pPr>
+            <w:r>
+              <w:t xml:space="preserve">RF-024</w:t>
+            </w:r>
+          </w:p>
+        </w:tc>
+        <w:tc>
+          <w:tcPr/>
+          <w:p>
+            <w:pPr>
+              <w:pStyle w:val="Compact"/>
+              <w:jc w:val="left"/>
+            </w:pPr>
+            <w:r>
+              <w:t xml:space="preserve">Corrida Segura</w:t>
+            </w:r>
+          </w:p>
+        </w:tc>
+        <w:tc>
+          <w:tcPr/>
+          <w:p>
+            <w:pPr>
+              <w:pStyle w:val="Compact"/>
+              <w:jc w:val="left"/>
+            </w:pPr>
+            <w:r>
+              <w:t xml:space="preserve">O usuário deve poder cadastrar até 5 contatos e, em cada corrida, ligar a Escolta para que eles acompanhem sua localização ao vivo. A tela de corrida deve ter um botão SOS sempre visível, que envia a localização atual aos contatos. Se o usuário ficar parado por mais de 10 minutos, o sistema deve perguntar se está tudo bem e, sem resposta em 60 segundos, avisar os contatos.</w:t>
+            </w:r>
+          </w:p>
+        </w:tc>
+        <w:tc>
+          <w:tcPr/>
+          <w:p>
+            <w:pPr>
+              <w:pStyle w:val="Compact"/>
+              <w:jc w:val="left"/>
+            </w:pPr>
+            <w:r>
+              <w:t xml:space="preserve">Alta</w:t>
+            </w:r>
+          </w:p>
+        </w:tc>
+      </w:tr>
+      <w:tr>
+        <w:tc>
+          <w:tcPr/>
+          <w:p>
+            <w:pPr>
+              <w:pStyle w:val="Compact"/>
+              <w:jc w:val="left"/>
+            </w:pPr>
+            <w:r>
+              <w:t xml:space="preserve">RF-025</w:t>
+            </w:r>
+          </w:p>
+        </w:tc>
+        <w:tc>
+          <w:tcPr/>
+          <w:p>
+            <w:pPr>
+              <w:pStyle w:val="Compact"/>
+              <w:jc w:val="left"/>
+            </w:pPr>
+            <w:r>
+              <w:t xml:space="preserve">Guia por Voz</w:t>
+            </w:r>
+          </w:p>
+        </w:tc>
+        <w:tc>
+          <w:tcPr/>
+          <w:p>
+            <w:pPr>
+              <w:pStyle w:val="Compact"/>
+              <w:jc w:val="left"/>
+            </w:pPr>
+            <w:r>
+              <w:t xml:space="preserve">Durante a corrida, o sistema deve anunciar por voz cada quilômetro completado com o ritmo atual e os eventos de jogo (território rival, baú aberto, fantasma se aproximando). O usuário deve poder silenciar o Guia com um toque.</w:t>
+            </w:r>
+          </w:p>
+        </w:tc>
+        <w:tc>
+          <w:tcPr/>
+          <w:p>
+            <w:pPr>
+              <w:pStyle w:val="Compact"/>
+              <w:jc w:val="left"/>
+            </w:pPr>
+            <w:r>
+              <w:t xml:space="preserve">Média</w:t>
+            </w:r>
+          </w:p>
+        </w:tc>
+      </w:tr>
+      <w:tr>
+        <w:tc>
+          <w:tcPr/>
+          <w:p>
+            <w:pPr>
+              <w:pStyle w:val="Compact"/>
+              <w:jc w:val="left"/>
+            </w:pPr>
+            <w:r>
+              <w:t xml:space="preserve">RF-026</w:t>
+            </w:r>
+          </w:p>
+        </w:tc>
+        <w:tc>
+          <w:tcPr/>
+          <w:p>
+            <w:pPr>
+              <w:pStyle w:val="Compact"/>
+              <w:jc w:val="left"/>
+            </w:pPr>
+            <w:r>
+              <w:t xml:space="preserve">Raid da Cidade</w:t>
+            </w:r>
+          </w:p>
+        </w:tc>
+        <w:tc>
+          <w:tcPr/>
+          <w:p>
+            <w:pPr>
+              <w:pStyle w:val="Compact"/>
+              <w:jc w:val="left"/>
+            </w:pPr>
+            <w:r>
+              <w:t xml:space="preserve">O sistema deve exibir o Raid ativo da cidade, com barra de vida coletiva, tempo restante e ranking de Crews por dano, e somar automaticamente os quilômetros válidos de cada corrida ao dano (RN-018).</w:t>
+            </w:r>
+          </w:p>
+        </w:tc>
+        <w:tc>
+          <w:tcPr/>
+          <w:p>
+            <w:pPr>
+              <w:pStyle w:val="Compact"/>
+              <w:jc w:val="left"/>
+            </w:pPr>
+            <w:r>
+              <w:t xml:space="preserve">Baixa</w:t>
+            </w:r>
+          </w:p>
+        </w:tc>
+      </w:tr>
+      <w:tr>
+        <w:tc>
+          <w:tcPr/>
+          <w:p>
+            <w:pPr>
+              <w:pStyle w:val="Compact"/>
+              <w:jc w:val="left"/>
+            </w:pPr>
+            <w:r>
+              <w:t xml:space="preserve">RF-027</w:t>
+            </w:r>
+          </w:p>
+        </w:tc>
+        <w:tc>
+          <w:tcPr/>
+          <w:p>
+            <w:pPr>
+              <w:pStyle w:val="Compact"/>
+              <w:jc w:val="left"/>
+            </w:pPr>
+            <w:r>
+              <w:t xml:space="preserve">Liga do Bairro</w:t>
+            </w:r>
+          </w:p>
+        </w:tc>
+        <w:tc>
+          <w:tcPr/>
+          <w:p>
+            <w:pPr>
+              <w:pStyle w:val="Compact"/>
+              <w:jc w:val="left"/>
+            </w:pPr>
+            <w:r>
+              <w:t xml:space="preserve">O sistema deve colocar cada usuário num grupo semanal (RN-015), exibir sua posição e indicar se ele está na zona de subida, de permanência ou de queda.</w:t>
             </w:r>
           </w:p>
         </w:tc>
@@ -5008,6 +5732,57 @@
           </w:p>
         </w:tc>
       </w:tr>
+      <w:tr>
+        <w:tc>
+          <w:tcPr/>
+          <w:p>
+            <w:pPr>
+              <w:pStyle w:val="Compact"/>
+              <w:jc w:val="left"/>
+            </w:pPr>
+            <w:r>
+              <w:t xml:space="preserve">RNF-015</w:t>
+            </w:r>
+          </w:p>
+        </w:tc>
+        <w:tc>
+          <w:tcPr/>
+          <w:p>
+            <w:pPr>
+              <w:pStyle w:val="Compact"/>
+              <w:jc w:val="left"/>
+            </w:pPr>
+            <w:r>
+              <w:t xml:space="preserve">Usabilidade (tela de corrida)</w:t>
+            </w:r>
+          </w:p>
+        </w:tc>
+        <w:tc>
+          <w:tcPr/>
+          <w:p>
+            <w:pPr>
+              <w:pStyle w:val="Compact"/>
+              <w:jc w:val="left"/>
+            </w:pPr>
+            <w:r>
+              <w:t xml:space="preserve">A tela de corrida deve mostrar no máximo 3 métricas principais, com números de pelo menos 48 pt (tempo com pelo menos 72 pt) e algarismos de largura fixa, legíveis sob sol. Os controles devem ter área de toque de pelo menos 56 pt, e o encerramento da corrida deve exigir manter o botão pressionado por</w:t>
+            </w:r>
+            <w:r>
+              <w:t xml:space="preserve"> </w:t>
+            </w:r>
+            <w:r>
+              <w:rPr>
+                <w:bCs/>
+                <w:b/>
+              </w:rPr>
+              <w:t xml:space="preserve">600 ms</w:t>
+            </w:r>
+            <w:r>
+              <w:t xml:space="preserve">, para evitar o fim acidental com o celular no bolso.</w:t>
+            </w:r>
+          </w:p>
+        </w:tc>
+      </w:tr>
     </w:tbl>
     <w:bookmarkEnd w:id="34"/>
     <w:bookmarkStart w:id="35" w:name="regras-de-negócio-rn"/>
@@ -5093,7 +5868,7 @@
               <w:jc w:val="left"/>
             </w:pPr>
             <w:r>
-              <w:t xml:space="preserve">Cálculo de Pontos (Ritmo × Distância)</w:t>
+              <w:t xml:space="preserve">Cálculo de Pontos (Esforço × Distância)</w:t>
             </w:r>
           </w:p>
         </w:tc>
@@ -5115,7 +5890,7 @@
                 <w:bCs/>
                 <w:b/>
               </w:rPr>
-              <w:t xml:space="preserve">RP = metros válidos × 0,1 × M_ritmo × M_sequência × M_fantasma × M_grupo × M_defesa</w:t>
+              <w:t xml:space="preserve">RP = metros válidos × 0,1 × M_esforço × M_sequência × M_fantasma × M_grupo × M_defesa</w:t>
             </w:r>
             <w:r>
               <w:t xml:space="preserve">, arredondado para número inteiro.</w:t>
@@ -5128,13 +5903,26 @@
                 <w:bCs/>
                 <w:b/>
               </w:rPr>
-              <w:t xml:space="preserve">M_ritmo</w:t>
-            </w:r>
-            <w:r>
-              <w:t xml:space="preserve"> </w:t>
-            </w:r>
-            <w:r>
-              <w:t xml:space="preserve">= 360 ÷ ritmo em segundos por km, limitado entre 0,75 e 1,50 (referência de 6:00 min/km; ex.: ritmo de 5:00 min/km resulta em 1,20).</w:t>
+              <w:t xml:space="preserve">M_esforço</w:t>
+            </w:r>
+            <w:r>
+              <w:t xml:space="preserve"> </w:t>
+            </w:r>
+            <w:r>
+              <w:t xml:space="preserve">= ritmo-base ÷ ritmo da corrida, limitado entre</w:t>
+            </w:r>
+            <w:r>
+              <w:t xml:space="preserve"> </w:t>
+            </w:r>
+            <w:r>
+              <w:rPr>
+                <w:bCs/>
+                <w:b/>
+              </w:rPr>
+              <w:t xml:space="preserve">0,8 e 1,3</w:t>
+            </w:r>
+            <w:r>
+              <w:t xml:space="preserve">. O ritmo-base é a mediana do ritmo das últimas 10 corridas válidas do próprio usuário; sem histórico, vale 6:00 min/km. Assim, correr no próprio limite vale o mesmo para iniciantes e atletas.</w:t>
             </w:r>
             <w:r>
               <w:t xml:space="preserve"> </w:t>
@@ -5150,7 +5938,7 @@
               <w:t xml:space="preserve"> </w:t>
             </w:r>
             <w:r>
-              <w:t xml:space="preserve">= 1 + 0,05 × dias seguidos de corrida (máximo de 10 dias, resultando em 1,50).</w:t>
+              <w:t xml:space="preserve">= 1 + 0,05 × semanas da sequência semanal (RN-014), até o máximo de 10 semanas (1,50).</w:t>
             </w:r>
             <w:r>
               <w:t xml:space="preserve"> </w:t>
@@ -5230,7 +6018,7 @@
               <w:t xml:space="preserve"> </w:t>
             </w:r>
             <w:r>
-              <w:t xml:space="preserve">800 m a 5:00 min/km com 4 dias seguidos de corrida: 800 × 0,1 × 1,20 × 1,20 =</w:t>
+              <w:t xml:space="preserve">800 m a 5:00 min/km, ritmo-base de 6:00 e sequência de 4 semanas: 800 × 0,1 × 1,20 × 1,20 =</w:t>
             </w:r>
             <w:r>
               <w:t xml:space="preserve"> </w:t>
@@ -5291,10 +6079,13 @@
                 <w:bCs/>
                 <w:b/>
               </w:rPr>
-              <w:t xml:space="preserve">influência igual ou superior a 100</w:t>
-            </w:r>
-            <w:r>
-              <w:t xml:space="preserve">. Uma zona com dono só muda de dono quando</w:t>
+              <w:t xml:space="preserve">influência igual ou superior a 30</w:t>
+            </w:r>
+            <w:r>
+              <w:t xml:space="preserve"> </w:t>
+            </w:r>
+            <w:r>
+              <w:t xml:space="preserve">(cerca de 300 m corridos dentro dela), para que a primeira corrida de um iniciante já conquiste algo. Uma zona com dono só muda de dono quando</w:t>
             </w:r>
             <w:r>
               <w:t xml:space="preserve"> </w:t>
@@ -5307,7 +6098,10 @@
               <w:t xml:space="preserve">a influência da facção desafiante for igual ou superior a 110% da influência do dono</w:t>
             </w:r>
             <w:r>
-              <w:t xml:space="preserve">. Em caso de empate, o dono atual é mantido. Zonas bloqueadas nunca têm dono.</w:t>
+              <w:t xml:space="preserve"> </w:t>
+            </w:r>
+            <w:r>
+              <w:t xml:space="preserve">(e de pelo menos 30). Em caso de empate, o dono atual é mantido. Zonas bloqueadas nunca têm dono.</w:t>
             </w:r>
           </w:p>
         </w:tc>
@@ -5543,7 +6337,7 @@
               <w:t xml:space="preserve">0,90</w:t>
             </w:r>
             <w:r>
-              <w:t xml:space="preserve">. Valores abaixo de 5 são zerados. Se a influência do dono ficar abaixo de 100, a zona volta a ser</w:t>
+              <w:t xml:space="preserve">. Valores abaixo de 5 são zerados. Se a influência do dono ficar abaixo de 30, a zona volta a ser</w:t>
             </w:r>
             <w:r>
               <w:t xml:space="preserve"> </w:t>
@@ -6082,13 +6876,360 @@
             </w:r>
             <w:r>
               <w:t xml:space="preserve">(com pelo menos uma corrida válida na temporada). A divisão permite que cidades menores concorram com as capitais. Só participam do placar cidades com 20 ou mais corredores ativos. A cidade natal pode ser trocada uma vez por temporada.</w:t>
+            </w:r>
+          </w:p>
+        </w:tc>
+      </w:tr>
+      <w:tr>
+        <w:tc>
+          <w:tcPr/>
+          <w:p>
+            <w:pPr>
+              <w:pStyle w:val="Compact"/>
+              <w:jc w:val="left"/>
+            </w:pPr>
+            <w:r>
+              <w:t xml:space="preserve">RN-014</w:t>
+            </w:r>
+          </w:p>
+        </w:tc>
+        <w:tc>
+          <w:tcPr/>
+          <w:p>
+            <w:pPr>
+              <w:pStyle w:val="Compact"/>
+              <w:jc w:val="left"/>
+            </w:pPr>
+            <w:r>
+              <w:t xml:space="preserve">Sequência Semanal</w:t>
+            </w:r>
+          </w:p>
+        </w:tc>
+        <w:tc>
+          <w:tcPr/>
+          <w:p>
+            <w:pPr>
+              <w:pStyle w:val="Compact"/>
+              <w:jc w:val="left"/>
+            </w:pPr>
+            <w:r>
+              <w:t xml:space="preserve">A semana conta para a sequência quando o usuário faz</w:t>
+            </w:r>
+            <w:r>
+              <w:t xml:space="preserve"> </w:t>
+            </w:r>
+            <w:r>
+              <w:rPr>
+                <w:bCs/>
+                <w:b/>
+              </w:rPr>
+              <w:t xml:space="preserve">pelo menos 2 corridas válidas</w:t>
+            </w:r>
+            <w:r>
+              <w:t xml:space="preserve"> </w:t>
+            </w:r>
+            <w:r>
+              <w:t xml:space="preserve">entre segunda e domingo. O usuário tem</w:t>
+            </w:r>
+            <w:r>
+              <w:t xml:space="preserve"> </w:t>
+            </w:r>
+            <w:r>
+              <w:rPr>
+                <w:bCs/>
+                <w:b/>
+              </w:rPr>
+              <w:t xml:space="preserve">1 congelamento grátis por mês</w:t>
+            </w:r>
+            <w:r>
+              <w:t xml:space="preserve">, que mantém a sequência numa semana com menos de 2 corridas. Sem congelamento disponível, a sequência volta a zero. Não existe sequência diária, para não punir o descanso.</w:t>
+            </w:r>
+          </w:p>
+        </w:tc>
+      </w:tr>
+      <w:tr>
+        <w:tc>
+          <w:tcPr/>
+          <w:p>
+            <w:pPr>
+              <w:pStyle w:val="Compact"/>
+              <w:jc w:val="left"/>
+            </w:pPr>
+            <w:r>
+              <w:t xml:space="preserve">RN-015</w:t>
+            </w:r>
+          </w:p>
+        </w:tc>
+        <w:tc>
+          <w:tcPr/>
+          <w:p>
+            <w:pPr>
+              <w:pStyle w:val="Compact"/>
+              <w:jc w:val="left"/>
+            </w:pPr>
+            <w:r>
+              <w:t xml:space="preserve">Liga do Bairro</w:t>
+            </w:r>
+          </w:p>
+        </w:tc>
+        <w:tc>
+          <w:tcPr/>
+          <w:p>
+            <w:pPr>
+              <w:pStyle w:val="Compact"/>
+              <w:jc w:val="left"/>
+            </w:pPr>
+            <w:r>
+              <w:t xml:space="preserve">Cada semana, os usuários são agrupados em grupos de 30 com volume de corrida parecido, em 5 divisões (Calçada, Rua, Avenida, Rodovia e Maratona). Ao fim da semana, os</w:t>
+            </w:r>
+            <w:r>
+              <w:t xml:space="preserve"> </w:t>
+            </w:r>
+            <w:r>
+              <w:rPr>
+                <w:bCs/>
+                <w:b/>
+              </w:rPr>
+              <w:t xml:space="preserve">5 primeiros sobem</w:t>
+            </w:r>
+            <w:r>
+              <w:t xml:space="preserve"> </w:t>
+            </w:r>
+            <w:r>
+              <w:t xml:space="preserve">de divisão e os</w:t>
+            </w:r>
+            <w:r>
+              <w:t xml:space="preserve"> </w:t>
+            </w:r>
+            <w:r>
+              <w:rPr>
+                <w:bCs/>
+                <w:b/>
+              </w:rPr>
+              <w:t xml:space="preserve">5 últimos descem</w:t>
+            </w:r>
+            <w:r>
+              <w:t xml:space="preserve">. Ninguém desce da primeira divisão nem sobe da última.</w:t>
+            </w:r>
+          </w:p>
+        </w:tc>
+      </w:tr>
+      <w:tr>
+        <w:tc>
+          <w:tcPr/>
+          <w:p>
+            <w:pPr>
+              <w:pStyle w:val="Compact"/>
+              <w:jc w:val="left"/>
+            </w:pPr>
+            <w:r>
+              <w:t xml:space="preserve">RN-016</w:t>
+            </w:r>
+          </w:p>
+        </w:tc>
+        <w:tc>
+          <w:tcPr/>
+          <w:p>
+            <w:pPr>
+              <w:pStyle w:val="Compact"/>
+              <w:jc w:val="left"/>
+            </w:pPr>
+            <w:r>
+              <w:t xml:space="preserve">Neblina</w:t>
+            </w:r>
+          </w:p>
+        </w:tc>
+        <w:tc>
+          <w:tcPr/>
+          <w:p>
+            <w:pPr>
+              <w:pStyle w:val="Compact"/>
+              <w:jc w:val="left"/>
+            </w:pPr>
+            <w:r>
+              <w:t xml:space="preserve">O mapa é dividido em células menores que as zonas (cerca de 15.000 m²). Cada célula cujo centro fique a</w:t>
+            </w:r>
+            <w:r>
+              <w:t xml:space="preserve"> </w:t>
+            </w:r>
+            <w:r>
+              <w:rPr>
+                <w:bCs/>
+                <w:b/>
+              </w:rPr>
+              <w:t xml:space="preserve">até 30 m</w:t>
+            </w:r>
+            <w:r>
+              <w:t xml:space="preserve"> </w:t>
+            </w:r>
+            <w:r>
+              <w:t xml:space="preserve">de um trecho válido percorrido é revelada para sempre para aquele usuário. Cada célula nova vale</w:t>
+            </w:r>
+            <w:r>
+              <w:t xml:space="preserve"> </w:t>
+            </w:r>
+            <w:r>
+              <w:rPr>
+                <w:bCs/>
+                <w:b/>
+              </w:rPr>
+              <w:t xml:space="preserve">10 XP</w:t>
+            </w:r>
+            <w:r>
+              <w:t xml:space="preserve">; revelar a mesma célula de novo não vale nada.</w:t>
+            </w:r>
+          </w:p>
+        </w:tc>
+      </w:tr>
+      <w:tr>
+        <w:tc>
+          <w:tcPr/>
+          <w:p>
+            <w:pPr>
+              <w:pStyle w:val="Compact"/>
+              <w:jc w:val="left"/>
+            </w:pPr>
+            <w:r>
+              <w:t xml:space="preserve">RN-017</w:t>
+            </w:r>
+          </w:p>
+        </w:tc>
+        <w:tc>
+          <w:tcPr/>
+          <w:p>
+            <w:pPr>
+              <w:pStyle w:val="Compact"/>
+              <w:jc w:val="left"/>
+            </w:pPr>
+            <w:r>
+              <w:t xml:space="preserve">Caça</w:t>
+            </w:r>
+          </w:p>
+        </w:tc>
+        <w:tc>
+          <w:tcPr/>
+          <w:p>
+            <w:pPr>
+              <w:pStyle w:val="Compact"/>
+              <w:jc w:val="left"/>
+            </w:pPr>
+            <w:r>
+              <w:t xml:space="preserve">Todos os dias são sorteados de 5 a 8 baús por usuário num raio de 3 km da última corrida, sempre em ruas e parques e nunca em zonas bloqueadas. Um baú abre quando o usuário passa a</w:t>
+            </w:r>
+            <w:r>
+              <w:t xml:space="preserve"> </w:t>
+            </w:r>
+            <w:r>
+              <w:rPr>
+                <w:bCs/>
+                <w:b/>
+              </w:rPr>
+              <w:t xml:space="preserve">até 25 m</w:t>
+            </w:r>
+            <w:r>
+              <w:t xml:space="preserve"> </w:t>
+            </w:r>
+            <w:r>
+              <w:t xml:space="preserve">dele correndo. Raridades e recompensas: comum (70%, 20 XP), raro (25%, 60 XP) e lendário (5%, 150 XP). Cada baú abre uma única vez.</w:t>
+            </w:r>
+          </w:p>
+        </w:tc>
+      </w:tr>
+      <w:tr>
+        <w:tc>
+          <w:tcPr/>
+          <w:p>
+            <w:pPr>
+              <w:pStyle w:val="Compact"/>
+              <w:jc w:val="left"/>
+            </w:pPr>
+            <w:r>
+              <w:t xml:space="preserve">RN-018</w:t>
+            </w:r>
+          </w:p>
+        </w:tc>
+        <w:tc>
+          <w:tcPr/>
+          <w:p>
+            <w:pPr>
+              <w:pStyle w:val="Compact"/>
+              <w:jc w:val="left"/>
+            </w:pPr>
+            <w:r>
+              <w:t xml:space="preserve">Raid</w:t>
+            </w:r>
+          </w:p>
+        </w:tc>
+        <w:tc>
+          <w:tcPr/>
+          <w:p>
+            <w:pPr>
+              <w:pStyle w:val="Compact"/>
+              <w:jc w:val="left"/>
+            </w:pPr>
+            <w:r>
+              <w:t xml:space="preserve">O chefão da cidade tem vida igual a</w:t>
+            </w:r>
+            <w:r>
+              <w:t xml:space="preserve"> </w:t>
+            </w:r>
+            <w:r>
+              <w:rPr>
+                <w:bCs/>
+                <w:b/>
+              </w:rPr>
+              <w:t xml:space="preserve">1 km × 30% dos corredores ativos</w:t>
+            </w:r>
+            <w:r>
+              <w:t xml:space="preserve"> </w:t>
+            </w:r>
+            <w:r>
+              <w:t xml:space="preserve">da cidade e dura 48 horas. Cada quilômetro válido de qualquer corredor da cidade causa 1 km de dano. Se a vida chegar a zero no prazo, todos os participantes recebem a recompensa.</w:t>
+            </w:r>
+          </w:p>
+        </w:tc>
+      </w:tr>
+      <w:tr>
+        <w:tc>
+          <w:tcPr/>
+          <w:p>
+            <w:pPr>
+              <w:pStyle w:val="Compact"/>
+              <w:jc w:val="left"/>
+            </w:pPr>
+            <w:r>
+              <w:t xml:space="preserve">RN-019</w:t>
+            </w:r>
+          </w:p>
+        </w:tc>
+        <w:tc>
+          <w:tcPr/>
+          <w:p>
+            <w:pPr>
+              <w:pStyle w:val="Compact"/>
+              <w:jc w:val="left"/>
+            </w:pPr>
+            <w:r>
+              <w:t xml:space="preserve">Fuga</w:t>
+            </w:r>
+          </w:p>
+        </w:tc>
+        <w:tc>
+          <w:tcPr/>
+          <w:p>
+            <w:pPr>
+              <w:pStyle w:val="Compact"/>
+              <w:jc w:val="left"/>
+            </w:pPr>
+            <w:r>
+              <w:t xml:space="preserve">O fantasma corre em ritmo constante. A diferença é calculada por: distância do usuário − (tempo em movimento ÷ ritmo do fantasma). Diferença maior que 5 m: usuário à frente; entre −5 m e 5 m: lado a lado; menor que −5 m: o fantasma passou. Terminar a corrida à frente dá o multiplicador de 1,5 da RN-001 e 50 XP.</w:t>
             </w:r>
           </w:p>
         </w:tc>
       </w:tr>
     </w:tbl>
     <w:bookmarkEnd w:id="35"/>
-    <w:bookmarkStart w:id="48" w:name="casos-de-uso-e-interfaces"/>
+    <w:bookmarkStart w:id="51" w:name="casos-de-uso-e-interfaces"/>
     <w:p>
       <w:pPr>
         <w:pStyle w:val="Heading1"/>
@@ -6419,7 +7560,7 @@
               <w:t xml:space="preserve"> </w:t>
             </w:r>
             <w:r>
-              <w:t xml:space="preserve">na tela do mapa. 2. O sistema verifica o sinal de GPS e exibe uma contagem regressiva de 3 segundos. 3. O sistema inicia a gravação e exibe tempo, distância, ritmo e a zona atual com a barra de influência. 4. O corredor percorre uma ou mais zonas, e o sistema mostra uma estimativa dos pontos ganhos em cada uma. 5. O corredor finaliza a corrida. 6. O aplicativo envia os pontos restantes ao servidor. 7. O servidor executa as verificações antifraude (RN-007 e RN-008) e calcula os pontos de cada zona (RN-001). 8. O servidor aplica as regras de conquista (RN-002) e registra os eventos. 9. O aplicativo exibe o resumo da corrida com as zonas afetadas e o aviso</w:t>
+              <w:t xml:space="preserve">na tela do mapa e escolhe a missão (Corrida livre, Fuga ou Caça) e, se quiser, liga a Corrida Segura. 2. O sistema verifica o sinal de GPS e exibe uma contagem regressiva de 3 segundos. 3. O sistema inicia a gravação e exibe tempo, distância, ritmo e a zona atual com a barra de influência. 4. O corredor percorre uma ou mais zonas, e o sistema mostra uma estimativa dos pontos ganhos em cada uma. 5. O corredor finaliza a corrida. 6. O aplicativo envia os pontos restantes ao servidor. 7. O servidor executa as verificações antifraude (RN-007 e RN-008) e calcula os pontos de cada zona (RN-001). 8. O servidor aplica as regras de conquista (RN-002) e registra os eventos. 9. O aplicativo exibe o resumo da corrida com as zonas afetadas e o aviso</w:t>
             </w:r>
             <w:r>
               <w:t xml:space="preserve"> </w:t>
@@ -6884,7 +8025,7 @@
               <w:t xml:space="preserve">”</w:t>
             </w:r>
             <w:r>
-              <w:t xml:space="preserve">. 3. O corredor toca na notificação. 4. O aplicativo abre o mapa centralizado na zona, com borda vermelha, contagem regressiva do prazo de 24 horas e comparação de influência entre dono e atacante. 5. O corredor executa o</w:t>
+              <w:t xml:space="preserve">. 3. O corredor toca na notificação. 4. O aplicativo abre o mapa centralizado na zona, com o contorno em faixa de sinalização, contagem regressiva do prazo de 24 horas e comparação de influência entre dono e atacante. 5. O corredor executa o</w:t>
             </w:r>
             <w:r>
               <w:t xml:space="preserve"> </w:t>
@@ -7382,7 +8523,7 @@
     </w:tbl>
     <w:bookmarkEnd w:id="41"/>
     <w:bookmarkEnd w:id="42"/>
-    <w:bookmarkStart w:id="46" w:name="X2cf47918db365cc2fe4e1e8b1f475142323b239"/>
+    <w:bookmarkStart w:id="49" w:name="X2cf47918db365cc2fe4e1e8b1f475142323b239"/>
     <w:p>
       <w:pPr>
         <w:pStyle w:val="Heading2"/>
@@ -7412,7 +8553,7 @@
         <w:t xml:space="preserve"> </w:t>
       </w:r>
       <w:r>
-        <w:t xml:space="preserve">(Google Maps e Waze), que ocupa a maior parte da tela inicial, e o</w:t>
+        <w:t xml:space="preserve">(Google Maps e Waze), que ocupa a tela inicial, e o</w:t>
       </w:r>
       <w:r>
         <w:t xml:space="preserve"> </w:t>
@@ -7428,7 +8569,34 @@
         <w:t xml:space="preserve"> </w:t>
       </w:r>
       <w:r>
-        <w:t xml:space="preserve">(Strava). Os territórios aparecem como uma camada por cima do mapa, sem esconder as ruas, os nomes e os pontos de referência.</w:t>
+        <w:t xml:space="preserve">(Strava). A identidade visual, chamada</w:t>
+      </w:r>
+      <w:r>
+        <w:t xml:space="preserve"> </w:t>
+      </w:r>
+      <w:r>
+        <w:rPr>
+          <w:bCs/>
+          <w:b/>
+        </w:rPr>
+        <w:t xml:space="preserve">“</w:t>
+      </w:r>
+      <w:r>
+        <w:rPr>
+          <w:bCs/>
+          <w:b/>
+        </w:rPr>
+        <w:t xml:space="preserve">Asfalto &amp; Giz</w:t>
+      </w:r>
+      <w:r>
+        <w:rPr>
+          <w:bCs/>
+          <w:b/>
+        </w:rPr>
+        <w:t xml:space="preserve">”</w:t>
+      </w:r>
+      <w:r>
+        <w:t xml:space="preserve">, vem do vocabulário da corrida de rua: o mapa tem a cor fria do concreto, os territórios parecem marcações de giz no asfalto (cada time com sua hachura) e a ação principal usa o amarelo da sinalização viária.</w:t>
       </w:r>
     </w:p>
     <w:tbl>
@@ -7496,7 +8664,7 @@
               <w:jc w:val="left"/>
             </w:pPr>
             <w:r>
-              <w:t xml:space="preserve">Mapa vetorial com ruas, avenidas, nomes de vias, bairros, parques, lagos e pontos de interesse. Tema claro durante o dia e escuro automaticamente após o pôr do sol.</w:t>
+              <w:t xml:space="preserve">Mapa vetorial com ruas, avenidas, nomes de vias, bairros, parques, lagos e pontos de interesse, com cores dessaturadas para que os territórios sejam a única cor forte. Tema claro durante o dia e escuro automaticamente à noite.</w:t>
             </w:r>
           </w:p>
         </w:tc>
@@ -7526,62 +8694,81 @@
               <w:jc w:val="left"/>
             </w:pPr>
             <w:r>
-              <w:t xml:space="preserve">Hexágonos com</w:t>
-            </w:r>
-            <w:r>
-              <w:t xml:space="preserve"> </w:t>
-            </w:r>
-            <w:r>
-              <w:rPr>
-                <w:bCs/>
-                <w:b/>
-              </w:rPr>
-              <w:t xml:space="preserve">preenchimento de 20% a 30% de opacidade</w:t>
-            </w:r>
-            <w:r>
-              <w:t xml:space="preserve"> </w:t>
-            </w:r>
-            <w:r>
-              <w:t xml:space="preserve">e borda de 1,5 px na cor da facção dona. Zonas neutras não recebem preenchimento. Zonas sob ataque recebem borda vermelha (</w:t>
+              <w:t xml:space="preserve">Hexágonos com preenchimento de 20% a 30% de opacidade, borda na cor da facção dona e</w:t>
+            </w:r>
+            <w:r>
+              <w:t xml:space="preserve"> </w:t>
+            </w:r>
+            <w:r>
+              <w:rPr>
+                <w:bCs/>
+                <w:b/>
+              </w:rPr>
+              <w:t xml:space="preserve">padrão de hachura por facção</w:t>
+            </w:r>
+            <w:r>
+              <w:t xml:space="preserve">: Neon Striders listras, Urban Coyotes pontos, Night Owls ondas e Volt Runners xadrez. Zonas neutras sem preenchimento. Zonas sob ataque com contorno em</w:t>
+            </w:r>
+            <w:r>
+              <w:t xml:space="preserve"> </w:t>
+            </w:r>
+            <w:r>
+              <w:rPr>
+                <w:bCs/>
+                <w:b/>
+              </w:rPr>
+              <w:t xml:space="preserve">faixa de sinalização</w:t>
+            </w:r>
+            <w:r>
+              <w:t xml:space="preserve"> </w:t>
+            </w:r>
+            <w:r>
+              <w:t xml:space="preserve">(amarelo e asfalto).</w:t>
+            </w:r>
+          </w:p>
+        </w:tc>
+      </w:tr>
+      <w:tr>
+        <w:tc>
+          <w:tcPr/>
+          <w:p>
+            <w:pPr>
+              <w:pStyle w:val="Compact"/>
+              <w:jc w:val="left"/>
+            </w:pPr>
+            <w:r>
+              <w:rPr>
+                <w:bCs/>
+                <w:b/>
+              </w:rPr>
+              <w:t xml:space="preserve">Cores</w:t>
+            </w:r>
+          </w:p>
+        </w:tc>
+        <w:tc>
+          <w:tcPr/>
+          <w:p>
+            <w:pPr>
+              <w:pStyle w:val="Compact"/>
+              <w:jc w:val="left"/>
+            </w:pPr>
+            <w:r>
+              <w:t xml:space="preserve">Asfalto</w:t>
+            </w:r>
+            <w:r>
+              <w:t xml:space="preserve"> </w:t>
             </w:r>
             <w:r>
               <w:rPr>
                 <w:rStyle w:val="VerbatimChar"/>
               </w:rPr>
-              <w:t xml:space="preserve">#E53935</w:t>
-            </w:r>
-            <w:r>
-              <w:t xml:space="preserve">) tracejada e piscante.</w:t>
-            </w:r>
-          </w:p>
-        </w:tc>
-      </w:tr>
-      <w:tr>
-        <w:tc>
-          <w:tcPr/>
-          <w:p>
-            <w:pPr>
-              <w:pStyle w:val="Compact"/>
-              <w:jc w:val="left"/>
-            </w:pPr>
-            <w:r>
-              <w:rPr>
-                <w:bCs/>
-                <w:b/>
-              </w:rPr>
-              <w:t xml:space="preserve">Cores das facções</w:t>
-            </w:r>
-          </w:p>
-        </w:tc>
-        <w:tc>
-          <w:tcPr/>
-          <w:p>
-            <w:pPr>
-              <w:pStyle w:val="Compact"/>
-              <w:jc w:val="left"/>
-            </w:pPr>
-            <w:r>
-              <w:t xml:space="preserve">Neon Striders: ciano</w:t>
+              <w:t xml:space="preserve">#252A31</w:t>
+            </w:r>
+            <w:r>
+              <w:t xml:space="preserve"> </w:t>
+            </w:r>
+            <w:r>
+              <w:t xml:space="preserve">(texto), Concreto</w:t>
             </w:r>
             <w:r>
               <w:t xml:space="preserve"> </w:t>
@@ -7590,13 +8777,13 @@
               <w:rPr>
                 <w:rStyle w:val="VerbatimChar"/>
               </w:rPr>
-              <w:t xml:space="preserve">#00ACC1</w:t>
-            </w:r>
-            <w:r>
-              <w:t xml:space="preserve"> </w:t>
-            </w:r>
-            <w:r>
-              <w:t xml:space="preserve">· Urban Coyotes: laranja</w:t>
+              <w:t xml:space="preserve">#E8EBEE</w:t>
+            </w:r>
+            <w:r>
+              <w:t xml:space="preserve"> </w:t>
+            </w:r>
+            <w:r>
+              <w:t xml:space="preserve">(fundo), Giz</w:t>
             </w:r>
             <w:r>
               <w:t xml:space="preserve"> </w:t>
@@ -7605,13 +8792,13 @@
               <w:rPr>
                 <w:rStyle w:val="VerbatimChar"/>
               </w:rPr>
-              <w:t xml:space="preserve">#F57C00</w:t>
-            </w:r>
-            <w:r>
-              <w:t xml:space="preserve"> </w:t>
-            </w:r>
-            <w:r>
-              <w:t xml:space="preserve">· Night Owls: roxo</w:t>
+              <w:t xml:space="preserve">#FFFFFF</w:t>
+            </w:r>
+            <w:r>
+              <w:t xml:space="preserve"> </w:t>
+            </w:r>
+            <w:r>
+              <w:t xml:space="preserve">(superfícies), Sinalização</w:t>
             </w:r>
             <w:r>
               <w:t xml:space="preserve"> </w:t>
@@ -7620,13 +8807,13 @@
               <w:rPr>
                 <w:rStyle w:val="VerbatimChar"/>
               </w:rPr>
-              <w:t xml:space="preserve">#7E57C2</w:t>
-            </w:r>
-            <w:r>
-              <w:t xml:space="preserve"> </w:t>
-            </w:r>
-            <w:r>
-              <w:t xml:space="preserve">· Volt Runners: verde</w:t>
+              <w:t xml:space="preserve">#FFD23F</w:t>
+            </w:r>
+            <w:r>
+              <w:t xml:space="preserve"> </w:t>
+            </w:r>
+            <w:r>
+              <w:t xml:space="preserve">(ação principal), Meio-fio</w:t>
             </w:r>
             <w:r>
               <w:t xml:space="preserve"> </w:t>
@@ -7635,7 +8822,76 @@
               <w:rPr>
                 <w:rStyle w:val="VerbatimChar"/>
               </w:rPr>
-              <w:t xml:space="preserve">#7CB342</w:t>
+              <w:t xml:space="preserve">#6B7380</w:t>
+            </w:r>
+            <w:r>
+              <w:t xml:space="preserve"> </w:t>
+            </w:r>
+            <w:r>
+              <w:t xml:space="preserve">(texto secundário) e Alerta</w:t>
+            </w:r>
+            <w:r>
+              <w:t xml:space="preserve"> </w:t>
+            </w:r>
+            <w:r>
+              <w:rPr>
+                <w:rStyle w:val="VerbatimChar"/>
+              </w:rPr>
+              <w:t xml:space="preserve">#C62828</w:t>
+            </w:r>
+            <w:r>
+              <w:t xml:space="preserve"> </w:t>
+            </w:r>
+            <w:r>
+              <w:t xml:space="preserve">(SOS e erros). Facções, em paleta segura para daltônicos: Neon Striders</w:t>
+            </w:r>
+            <w:r>
+              <w:t xml:space="preserve"> </w:t>
+            </w:r>
+            <w:r>
+              <w:rPr>
+                <w:rStyle w:val="VerbatimChar"/>
+              </w:rPr>
+              <w:t xml:space="preserve">#0072B2</w:t>
+            </w:r>
+            <w:r>
+              <w:t xml:space="preserve">, Urban Coyotes</w:t>
+            </w:r>
+            <w:r>
+              <w:t xml:space="preserve"> </w:t>
+            </w:r>
+            <w:r>
+              <w:rPr>
+                <w:rStyle w:val="VerbatimChar"/>
+              </w:rPr>
+              <w:t xml:space="preserve">#D55E00</w:t>
+            </w:r>
+            <w:r>
+              <w:t xml:space="preserve">, Night Owls</w:t>
+            </w:r>
+            <w:r>
+              <w:t xml:space="preserve"> </w:t>
+            </w:r>
+            <w:r>
+              <w:rPr>
+                <w:rStyle w:val="VerbatimChar"/>
+              </w:rPr>
+              <w:t xml:space="preserve">#CC79A7</w:t>
+            </w:r>
+            <w:r>
+              <w:t xml:space="preserve"> </w:t>
+            </w:r>
+            <w:r>
+              <w:t xml:space="preserve">e Volt Runners</w:t>
+            </w:r>
+            <w:r>
+              <w:t xml:space="preserve"> </w:t>
+            </w:r>
+            <w:r>
+              <w:rPr>
+                <w:rStyle w:val="VerbatimChar"/>
+              </w:rPr>
+              <w:t xml:space="preserve">#009E73</w:t>
             </w:r>
             <w:r>
               <w:t xml:space="preserve">.</w:t>
@@ -7656,49 +8912,19 @@
                 <w:bCs/>
                 <w:b/>
               </w:rPr>
-              <w:t xml:space="preserve">Posição do usuário</w:t>
-            </w:r>
-          </w:p>
-        </w:tc>
-        <w:tc>
-          <w:tcPr/>
-          <w:p>
-            <w:pPr>
-              <w:pStyle w:val="Compact"/>
-              <w:jc w:val="left"/>
-            </w:pPr>
-            <w:r>
-              <w:t xml:space="preserve">Ponto azul com indicador de direção e círculo de precisão, no mesmo padrão dos aplicativos de navegação.</w:t>
-            </w:r>
-          </w:p>
-        </w:tc>
-      </w:tr>
-      <w:tr>
-        <w:tc>
-          <w:tcPr/>
-          <w:p>
-            <w:pPr>
-              <w:pStyle w:val="Compact"/>
-              <w:jc w:val="left"/>
-            </w:pPr>
-            <w:r>
-              <w:rPr>
-                <w:bCs/>
-                <w:b/>
-              </w:rPr>
-              <w:t xml:space="preserve">Percurso da corrida</w:t>
-            </w:r>
-          </w:p>
-        </w:tc>
-        <w:tc>
-          <w:tcPr/>
-          <w:p>
-            <w:pPr>
-              <w:pStyle w:val="Compact"/>
-              <w:jc w:val="left"/>
-            </w:pPr>
-            <w:r>
-              <w:t xml:space="preserve">Linha contínua de 5 px na cor da facção do usuário, com contorno branco para leitura sobre o mapa.</w:t>
+              <w:t xml:space="preserve">Posição do corredor e percurso</w:t>
+            </w:r>
+          </w:p>
+        </w:tc>
+        <w:tc>
+          <w:tcPr/>
+          <w:p>
+            <w:pPr>
+              <w:pStyle w:val="Compact"/>
+              <w:jc w:val="left"/>
+            </w:pPr>
+            <w:r>
+              <w:t xml:space="preserve">Ponto amarelo com borda asfalto. Percurso em linha asfalto com contorno branco, para contraste máximo sobre o mapa.</w:t>
             </w:r>
           </w:p>
         </w:tc>
@@ -7728,25 +8954,7 @@
               <w:jc w:val="left"/>
             </w:pPr>
             <w:r>
-              <w:t xml:space="preserve">Fonte sem serifa (Inter) em todo o aplicativo; números de tempo, distância e ritmo com algarismos de largura fixa, para não</w:t>
-            </w:r>
-            <w:r>
-              <w:t xml:space="preserve"> </w:t>
-            </w:r>
-            <w:r>
-              <w:t xml:space="preserve">“</w:t>
-            </w:r>
-            <w:r>
-              <w:t xml:space="preserve">tremerem</w:t>
-            </w:r>
-            <w:r>
-              <w:t xml:space="preserve">”</w:t>
-            </w:r>
-            <w:r>
-              <w:t xml:space="preserve"> </w:t>
-            </w:r>
-            <w:r>
-              <w:t xml:space="preserve">durante a corrida.</w:t>
+              <w:t xml:space="preserve">Big Shoulders Display (condensada, inspirada em placas de rua) para números e títulos; Figtree para o texto. Números com algarismos de largura fixa.</w:t>
             </w:r>
           </w:p>
         </w:tc>
@@ -7776,7 +8984,7 @@
               <w:jc w:val="left"/>
             </w:pPr>
             <w:r>
-              <w:t xml:space="preserve">Barra inferior com 5 opções: Mapa · Feed ·</w:t>
+              <w:t xml:space="preserve">Barra inferior nativa com 5 abas: Mapa, Arena, Atividades, Clube e Perfil. O botão</w:t>
             </w:r>
             <w:r>
               <w:t xml:space="preserve"> </w:t>
@@ -7792,7 +9000,7 @@
               <w:t xml:space="preserve"> </w:t>
             </w:r>
             <w:r>
-              <w:t xml:space="preserve">(botão central em destaque) · Ranking · Perfil.</w:t>
+              <w:t xml:space="preserve">fica em destaque na tela do mapa. A corrida abre em tela cheia e o detalhe da zona abre em folha deslizante.</w:t>
             </w:r>
           </w:p>
         </w:tc>
@@ -7872,6 +9080,82 @@
               <w:jc w:val="left"/>
             </w:pPr>
             <w:r>
+              <w:t xml:space="preserve">Pressionar um botão</w:t>
+            </w:r>
+          </w:p>
+        </w:tc>
+        <w:tc>
+          <w:tcPr/>
+          <w:p>
+            <w:pPr>
+              <w:pStyle w:val="Compact"/>
+              <w:jc w:val="left"/>
+            </w:pPr>
+            <w:r>
+              <w:t xml:space="preserve">O botão encolhe levemente (escala 0,97).</w:t>
+            </w:r>
+          </w:p>
+        </w:tc>
+        <w:tc>
+          <w:tcPr/>
+          <w:p>
+            <w:pPr>
+              <w:pStyle w:val="Compact"/>
+              <w:jc w:val="left"/>
+            </w:pPr>
+            <w:r>
+              <w:t xml:space="preserve">Duração de 120 ms.</w:t>
+            </w:r>
+          </w:p>
+        </w:tc>
+      </w:tr>
+      <w:tr>
+        <w:tc>
+          <w:tcPr/>
+          <w:p>
+            <w:pPr>
+              <w:pStyle w:val="Compact"/>
+              <w:jc w:val="left"/>
+            </w:pPr>
+            <w:r>
+              <w:t xml:space="preserve">Início da corrida</w:t>
+            </w:r>
+          </w:p>
+        </w:tc>
+        <w:tc>
+          <w:tcPr/>
+          <w:p>
+            <w:pPr>
+              <w:pStyle w:val="Compact"/>
+              <w:jc w:val="left"/>
+            </w:pPr>
+            <w:r>
+              <w:t xml:space="preserve">Contagem 3-2-1 em tela cheia, com vibração leve em cada número.</w:t>
+            </w:r>
+          </w:p>
+        </w:tc>
+        <w:tc>
+          <w:tcPr/>
+          <w:p>
+            <w:pPr>
+              <w:pStyle w:val="Compact"/>
+              <w:jc w:val="left"/>
+            </w:pPr>
+            <w:r>
+              <w:t xml:space="preserve">Cada número por 0,8 s.</w:t>
+            </w:r>
+          </w:p>
+        </w:tc>
+      </w:tr>
+      <w:tr>
+        <w:tc>
+          <w:tcPr/>
+          <w:p>
+            <w:pPr>
+              <w:pStyle w:val="Compact"/>
+              <w:jc w:val="left"/>
+            </w:pPr>
+            <w:r>
               <w:t xml:space="preserve">Entrar em território adversário</w:t>
             </w:r>
           </w:p>
@@ -7893,16 +9177,13 @@
               <w:t xml:space="preserve">“</w:t>
             </w:r>
             <w:r>
-              <w:t xml:space="preserve">Você entrou em território dos {facção}</w:t>
+              <w:t xml:space="preserve">Território dos {facção}</w:t>
             </w:r>
             <w:r>
               <w:t xml:space="preserve">”</w:t>
             </w:r>
             <w:r>
-              <w:t xml:space="preserve"> </w:t>
-            </w:r>
-            <w:r>
-              <w:t xml:space="preserve">e aviso por voz.</w:t>
+              <w:t xml:space="preserve">, vibração de alerta e aviso por voz.</w:t>
             </w:r>
           </w:p>
         </w:tc>
@@ -7928,6 +9209,59 @@
               <w:jc w:val="left"/>
             </w:pPr>
             <w:r>
+              <w:t xml:space="preserve">Defender o próprio território sob ataque</w:t>
+            </w:r>
+          </w:p>
+        </w:tc>
+        <w:tc>
+          <w:tcPr/>
+          <w:p>
+            <w:pPr>
+              <w:pStyle w:val="Compact"/>
+              <w:jc w:val="left"/>
+            </w:pPr>
+            <w:r>
+              <w:t xml:space="preserve">Faixa amarela</w:t>
+            </w:r>
+            <w:r>
+              <w:t xml:space="preserve"> </w:t>
+            </w:r>
+            <w:r>
+              <w:t xml:space="preserve">“</w:t>
+            </w:r>
+            <w:r>
+              <w:t xml:space="preserve">Defendendo seu território: pontos em dobro nesta zona</w:t>
+            </w:r>
+            <w:r>
+              <w:t xml:space="preserve">”</w:t>
+            </w:r>
+            <w:r>
+              <w:t xml:space="preserve">.</w:t>
+            </w:r>
+          </w:p>
+        </w:tc>
+        <w:tc>
+          <w:tcPr/>
+          <w:p>
+            <w:pPr>
+              <w:pStyle w:val="Compact"/>
+              <w:jc w:val="left"/>
+            </w:pPr>
+            <w:r>
+              <w:t xml:space="preserve">Exibida enquanto o usuário estiver na zona atacada.</w:t>
+            </w:r>
+          </w:p>
+        </w:tc>
+      </w:tr>
+      <w:tr>
+        <w:tc>
+          <w:tcPr/>
+          <w:p>
+            <w:pPr>
+              <w:pStyle w:val="Compact"/>
+              <w:jc w:val="left"/>
+            </w:pPr>
+            <w:r>
               <w:t xml:space="preserve">Zona conquistada</w:t>
             </w:r>
           </w:p>
@@ -7940,7 +9274,7 @@
               <w:jc w:val="left"/>
             </w:pPr>
             <w:r>
-              <w:t xml:space="preserve">O hexágono muda para a cor da facção do usuário com uma animação curta, o celular vibra e é exibido o aviso</w:t>
+              <w:t xml:space="preserve">O hexágono é</w:t>
             </w:r>
             <w:r>
               <w:t xml:space="preserve"> </w:t>
@@ -7949,12 +9283,30 @@
               <w:t xml:space="preserve">“</w:t>
             </w:r>
             <w:r>
-              <w:t xml:space="preserve">Zona conquistada · {zona} +{RP} RP</w:t>
+              <w:t xml:space="preserve">pintado</w:t>
             </w:r>
             <w:r>
               <w:t xml:space="preserve">”</w:t>
             </w:r>
             <w:r>
+              <w:t xml:space="preserve"> </w:t>
+            </w:r>
+            <w:r>
+              <w:t xml:space="preserve">por seis traços de giz em sequência, o celular vibra e aparece</w:t>
+            </w:r>
+            <w:r>
+              <w:t xml:space="preserve"> </w:t>
+            </w:r>
+            <w:r>
+              <w:t xml:space="preserve">“</w:t>
+            </w:r>
+            <w:r>
+              <w:t xml:space="preserve">Zona conquistada, +{RP} RP em {zona}</w:t>
+            </w:r>
+            <w:r>
+              <w:t xml:space="preserve">”</w:t>
+            </w:r>
+            <w:r>
               <w:t xml:space="preserve">.</w:t>
             </w:r>
           </w:p>
@@ -7967,83 +9319,45 @@
               <w:jc w:val="left"/>
             </w:pPr>
             <w:r>
-              <w:t xml:space="preserve">Exibido em até 1 segundo após a confirmação do servidor; aviso visível por 3 segundos.</w:t>
-            </w:r>
-          </w:p>
-        </w:tc>
-      </w:tr>
-      <w:tr>
-        <w:tc>
-          <w:tcPr/>
-          <w:p>
-            <w:pPr>
-              <w:pStyle w:val="Compact"/>
-              <w:jc w:val="left"/>
-            </w:pPr>
-            <w:r>
-              <w:t xml:space="preserve">Zona sob ataque</w:t>
-            </w:r>
-          </w:p>
-        </w:tc>
-        <w:tc>
-          <w:tcPr/>
-          <w:p>
-            <w:pPr>
-              <w:pStyle w:val="Compact"/>
-              <w:jc w:val="left"/>
-            </w:pPr>
-            <w:r>
-              <w:t xml:space="preserve">Borda vermelha piscante a cada 1,5 segundo.</w:t>
-            </w:r>
-          </w:p>
-        </w:tc>
-        <w:tc>
-          <w:tcPr/>
-          <w:p>
-            <w:pPr>
-              <w:pStyle w:val="Compact"/>
-              <w:jc w:val="left"/>
-            </w:pPr>
-            <w:r>
-              <w:t xml:space="preserve">Visível em aproximação de bairro ou maior.</w:t>
-            </w:r>
-          </w:p>
-        </w:tc>
-      </w:tr>
-      <w:tr>
-        <w:tc>
-          <w:tcPr/>
-          <w:p>
-            <w:pPr>
-              <w:pStyle w:val="Compact"/>
-              <w:jc w:val="left"/>
-            </w:pPr>
-            <w:r>
-              <w:t xml:space="preserve">Atualização da corrida</w:t>
-            </w:r>
-          </w:p>
-        </w:tc>
-        <w:tc>
-          <w:tcPr/>
-          <w:p>
-            <w:pPr>
-              <w:pStyle w:val="Compact"/>
-              <w:jc w:val="left"/>
-            </w:pPr>
-            <w:r>
-              <w:t xml:space="preserve">Tempo, distância e ritmo atualizados na tela.</w:t>
-            </w:r>
-          </w:p>
-        </w:tc>
-        <w:tc>
-          <w:tcPr/>
-          <w:p>
-            <w:pPr>
-              <w:pStyle w:val="Compact"/>
-              <w:jc w:val="left"/>
-            </w:pPr>
-            <w:r>
-              <w:t xml:space="preserve">Atualização a cada 1 segundo.</w:t>
+              <w:t xml:space="preserve">Traços com 60 ms de intervalo; exibido em até 1 segundo após a confirmação.</w:t>
+            </w:r>
+          </w:p>
+        </w:tc>
+      </w:tr>
+      <w:tr>
+        <w:tc>
+          <w:tcPr/>
+          <w:p>
+            <w:pPr>
+              <w:pStyle w:val="Compact"/>
+              <w:jc w:val="left"/>
+            </w:pPr>
+            <w:r>
+              <w:t xml:space="preserve">Encerrar a corrida</w:t>
+            </w:r>
+          </w:p>
+        </w:tc>
+        <w:tc>
+          <w:tcPr/>
+          <w:p>
+            <w:pPr>
+              <w:pStyle w:val="Compact"/>
+              <w:jc w:val="left"/>
+            </w:pPr>
+            <w:r>
+              <w:t xml:space="preserve">Anel de progresso ao redor do botão enquanto ele é pressionado.</w:t>
+            </w:r>
+          </w:p>
+        </w:tc>
+        <w:tc>
+          <w:tcPr/>
+          <w:p>
+            <w:pPr>
+              <w:pStyle w:val="Compact"/>
+              <w:jc w:val="left"/>
+            </w:pPr>
+            <w:r>
+              <w:t xml:space="preserve">A corrida só termina após 600 ms pressionado.</w:t>
             </w:r>
           </w:p>
         </w:tc>
@@ -8081,7 +9395,7 @@
               <w:jc w:val="left"/>
             </w:pPr>
             <w:r>
-              <w:t xml:space="preserve">Nenhuma animação de piscar, pulsar ou transição; apenas mudança de cor.</w:t>
+              <w:t xml:space="preserve">Sem deslocamentos, traços ou escalas; apenas mudanças de opacidade e cor.</w:t>
             </w:r>
           </w:p>
         </w:tc>
@@ -8114,7 +9428,7 @@
         <w:t xml:space="preserve"> </w:t>
       </w:r>
       <w:r>
-        <w:t xml:space="preserve">a Figura 2 apresenta os protótipos de alta fidelidade das três telas principais do aplicativo.</w:t>
+        <w:t xml:space="preserve">a Figura 2 apresenta os protótipos de alta fidelidade das três telas principais sobre o mapa da cidade, e a Figura 3 mostra telas do protótipo funcional do aplicativo.</w:t>
       </w:r>
     </w:p>
     <w:p>
@@ -8124,14 +9438,14 @@
       <w:r>
         <w:drawing>
           <wp:inline>
-            <wp:extent cx="5334000" cy="3484033"/>
+            <wp:extent cx="5334000" cy="3556000"/>
             <wp:effectExtent b="0" l="0" r="0" t="0"/>
             <wp:docPr descr="Figura 2: Protótipos das telas Mapa de Território, Corrida em Andamento e Resumo da Corrida" title="" id="44" name="Picture"/>
             <a:graphic>
               <a:graphicData uri="http://schemas.openxmlformats.org/drawingml/2006/picture">
                 <pic:pic>
                   <pic:nvPicPr>
-                    <pic:cNvPr descr="assets/wireframes.png" id="45" name="Picture"/>
+                    <pic:cNvPr descr="assets/prototipos.png" id="45" name="Picture"/>
                     <pic:cNvPicPr>
                       <a:picLocks noChangeArrowheads="1" noChangeAspect="1"/>
                     </pic:cNvPicPr>
@@ -8145,7 +9459,7 @@
                   <pic:spPr bwMode="auto">
                     <a:xfrm>
                       <a:off x="0" y="0"/>
-                      <a:ext cx="5334000" cy="3484033"/>
+                      <a:ext cx="5334000" cy="3556000"/>
                     </a:xfrm>
                     <a:prstGeom prst="rect">
                       <a:avLst/>
@@ -8191,7 +9505,7 @@
         <w:t xml:space="preserve"> </w:t>
       </w:r>
       <w:r>
-        <w:t xml:space="preserve">tela inicial. Mostra o mapa da região do usuário com os territórios de cada facção. Na parte superior, a barra de busca e os filtros; na inferior, o painel da zona selecionada, com a disputa de influência e o prazo de defesa.</w:t>
+        <w:t xml:space="preserve">tela inicial. Mostra a facção do usuário, os filtros de camada (Território e Minha neblina), os territórios de cada facção, o alerta de zona sob ataque e o botão Correr.</w:t>
       </w:r>
     </w:p>
     <w:p>
@@ -8213,7 +9527,7 @@
         <w:t xml:space="preserve"> </w:t>
       </w:r>
       <w:r>
-        <w:t xml:space="preserve">mapa aproximado com o percurso, aviso de entrada em território adversário e painel com tempo, distância, ritmo, cadência e progresso para conquistar a zona atual.</w:t>
+        <w:t xml:space="preserve">mapa aproximado com o percurso e o aviso de território adversário; painel com tempo, distância, ritmo atual e médio, zona atual com o progresso de conquista, e os controles (Guia por voz, segurar para encerrar e pausar), além do botão SOS.</w:t>
       </w:r>
     </w:p>
     <w:p>
@@ -8235,11 +9549,66 @@
         <w:t xml:space="preserve"> </w:t>
       </w:r>
       <w:r>
-        <w:t xml:space="preserve">mapa do percurso com as zonas conquistadas, métricas da corrida e lista de zonas afetadas, com os pontos ganhos e o resultado de cada uma.</w:t>
+        <w:t xml:space="preserve">celebração da zona conquistada, mapa do percurso, métricas da corrida e lista de zonas afetadas com os pontos ganhos e o resultado de cada uma.</w:t>
       </w:r>
     </w:p>
-    <w:bookmarkEnd w:id="46"/>
-    <w:bookmarkStart w:id="47" w:name="Xaff8b46edebfe0625c94a04c93ecfbc21a5ed18"/>
+    <w:p>
+      <w:pPr>
+        <w:pStyle w:val="CaptionedFigure"/>
+      </w:pPr>
+      <w:r>
+        <w:drawing>
+          <wp:inline>
+            <wp:extent cx="5334000" cy="2936837"/>
+            <wp:effectExtent b="0" l="0" r="0" t="0"/>
+            <wp:docPr descr="Figura 3: Telas do protótipo funcional: escolha do time, Arena, nova corrida e perfil" title="" id="47" name="Picture"/>
+            <a:graphic>
+              <a:graphicData uri="http://schemas.openxmlformats.org/drawingml/2006/picture">
+                <pic:pic>
+                  <pic:nvPicPr>
+                    <pic:cNvPr descr="assets/telas-reais.png" id="48" name="Picture"/>
+                    <pic:cNvPicPr>
+                      <a:picLocks noChangeArrowheads="1" noChangeAspect="1"/>
+                    </pic:cNvPicPr>
+                  </pic:nvPicPr>
+                  <pic:blipFill>
+                    <a:blip r:embed="rId46"/>
+                    <a:stretch>
+                      <a:fillRect/>
+                    </a:stretch>
+                  </pic:blipFill>
+                  <pic:spPr bwMode="auto">
+                    <a:xfrm>
+                      <a:off x="0" y="0"/>
+                      <a:ext cx="5334000" cy="2936837"/>
+                    </a:xfrm>
+                    <a:prstGeom prst="rect">
+                      <a:avLst/>
+                    </a:prstGeom>
+                    <a:noFill/>
+                    <a:ln w="9525">
+                      <a:noFill/>
+                      <a:headEnd/>
+                      <a:tailEnd/>
+                    </a:ln>
+                  </pic:spPr>
+                </pic:pic>
+              </a:graphicData>
+            </a:graphic>
+          </wp:inline>
+        </w:drawing>
+      </w:r>
+    </w:p>
+    <w:p>
+      <w:pPr>
+        <w:pStyle w:val="ImageCaption"/>
+      </w:pPr>
+      <w:r>
+        <w:t xml:space="preserve">Figura 3: Telas do protótipo funcional: escolha do time, Arena, nova corrida e perfil</w:t>
+      </w:r>
+    </w:p>
+    <w:bookmarkEnd w:id="49"/>
+    <w:bookmarkStart w:id="50" w:name="Xaff8b46edebfe0625c94a04c93ecfbc21a5ed18"/>
     <w:p>
       <w:pPr>
         <w:pStyle w:val="Heading2"/>
@@ -9238,9 +10607,9 @@
         </w:tc>
       </w:tr>
     </w:tbl>
-    <w:bookmarkEnd w:id="47"/>
-    <w:bookmarkEnd w:id="48"/>
-    <w:bookmarkStart w:id="49" w:name="aprovação-e-controle-de-revisões"/>
+    <w:bookmarkEnd w:id="50"/>
+    <w:bookmarkEnd w:id="51"/>
+    <w:bookmarkStart w:id="52" w:name="aprovação-e-controle-de-revisões"/>
     <w:p>
       <w:pPr>
         <w:pStyle w:val="Heading1"/>
@@ -9360,7 +10729,7 @@
               <w:jc w:val="left"/>
             </w:pPr>
             <w:r>
-              <w:t xml:space="preserve">Versão inicial do documento: introdução, descrição geral, 20 requisitos funcionais, 14 requisitos não funcionais, 13 regras de negócio, 3 casos de uso detalhados, protótipos de interface e interfaces de hardware e software.</w:t>
+              <w:t xml:space="preserve">Versão inicial do documento: introdução, descrição geral, 27 requisitos funcionais, 15 requisitos não funcionais, 19 regras de negócio, 3 casos de uso detalhados, protótipos de interface e interfaces de hardware e software.</w:t>
             </w:r>
           </w:p>
         </w:tc>
@@ -9579,7 +10948,7 @@
         </w:tc>
       </w:tr>
     </w:tbl>
-    <w:bookmarkEnd w:id="49"/>
+    <w:bookmarkEnd w:id="52"/>
     <w:sectPr/>
   </w:body>
 </w:document>

</xml_diff>